<commit_message>
Alert seeding: a builtin rule edited in the console keeps its values across restarts (operator_edited)
</commit_message>
<xml_diff>
--- a/docs/Alerting-Fixed.docx
+++ b/docs/Alerting-Fixed.docx
@@ -36,7 +36,7 @@
           <w:color w:val="64748B"/>
           <w:sz w:val="18"/>
         </w:rPr>
-        <w:t>Technical reference · generated from the live registry (server/src) on 16 Sep 2026 · Digital Operations</w:t>
+        <w:t>Technical reference v2 · generated from the live registry (server/src) on 16 Sep 2026 · Digital Operations · for review by the L1/L2 teams</w:t>
       </w:r>
     </w:p>
     <w:p>
@@ -25661,6 +25661,751 @@
                 <w:sz w:val="18"/>
               </w:rPr>
               <w:t>raise reopenMin / clearHoldMin (settings alert_flap) or move the threshold out of the noise band</w:t>
+            </w:r>
+          </w:p>
+        </w:tc>
+      </w:tr>
+    </w:tbl>
+    <w:p/>
+    <w:p>
+      <w:r>
+        <w:br w:type="page"/>
+      </w:r>
+    </w:p>
+    <w:p>
+      <w:pPr>
+        <w:pStyle w:val="Heading1"/>
+      </w:pPr>
+      <w:r>
+        <w:t>6. Data sources — console dataset ↔ prod source the L2 team monitors</w:t>
+      </w:r>
+    </w:p>
+    <w:p>
+      <w:r>
+        <w:rPr>
+          <w:b w:val="0"/>
+          <w:i w:val="0"/>
+        </w:rPr>
+        <w:t>The registry behind Alerts › ⛁ Data sources (server/src/datasets.js). For each dataset the console shows the live status (synced / lagging / stale / unavailable = newest row vs the expected lag, rows in the last hour) and stamps "data as of …" on every incident. Label, prod equivalent and expected lag are editable in the console (audited); pool, table and sync mechanism are facts of the deployment. Only these datasets can back a console-managed metric.</w:t>
+      </w:r>
+    </w:p>
+    <w:tbl>
+      <w:tblPr>
+        <w:tblStyle w:val="TableGrid"/>
+        <w:tblW w:type="auto" w:w="0"/>
+        <w:jc w:val="center"/>
+        <w:tblLook w:firstColumn="1" w:firstRow="1" w:lastColumn="0" w:lastRow="0" w:noHBand="0" w:noVBand="1" w:val="04A0"/>
+      </w:tblPr>
+      <w:tblGrid>
+        <w:gridCol w:w="2523"/>
+        <w:gridCol w:w="2523"/>
+        <w:gridCol w:w="2523"/>
+        <w:gridCol w:w="2523"/>
+        <w:gridCol w:w="2523"/>
+        <w:gridCol w:w="2523"/>
+      </w:tblGrid>
+      <w:tr>
+        <w:tc>
+          <w:tcPr>
+            <w:tcW w:type="dxa" w:w="2721"/>
+            <w:shd w:val="clear" w:color="auto" w:fill="0E9F5A"/>
+          </w:tcPr>
+          <w:p>
+            <w:r/>
+            <w:r>
+              <w:rPr>
+                <w:b/>
+                <w:color w:val="FFFFFF"/>
+                <w:sz w:val="17"/>
+              </w:rPr>
+              <w:t>Console dataset</w:t>
+            </w:r>
+          </w:p>
+        </w:tc>
+        <w:tc>
+          <w:tcPr>
+            <w:tcW w:type="dxa" w:w="2891"/>
+            <w:shd w:val="clear" w:color="auto" w:fill="0E9F5A"/>
+          </w:tcPr>
+          <w:p>
+            <w:r/>
+            <w:r>
+              <w:rPr>
+                <w:b/>
+                <w:color w:val="FFFFFF"/>
+                <w:sz w:val="17"/>
+              </w:rPr>
+              <w:t>Pool · table · time column</w:t>
+            </w:r>
+          </w:p>
+        </w:tc>
+        <w:tc>
+          <w:tcPr>
+            <w:tcW w:type="dxa" w:w="4422"/>
+            <w:shd w:val="clear" w:color="auto" w:fill="0E9F5A"/>
+          </w:tcPr>
+          <w:p>
+            <w:r/>
+            <w:r>
+              <w:rPr>
+                <w:b/>
+                <w:color w:val="FFFFFF"/>
+                <w:sz w:val="17"/>
+              </w:rPr>
+              <w:t>Prod equivalent (what L2 watches)</w:t>
+            </w:r>
+          </w:p>
+        </w:tc>
+        <w:tc>
+          <w:tcPr>
+            <w:tcW w:type="dxa" w:w="2721"/>
+            <w:shd w:val="clear" w:color="auto" w:fill="0E9F5A"/>
+          </w:tcPr>
+          <w:p>
+            <w:r/>
+            <w:r>
+              <w:rPr>
+                <w:b/>
+                <w:color w:val="FFFFFF"/>
+                <w:sz w:val="17"/>
+              </w:rPr>
+              <w:t>Sync mechanism</w:t>
+            </w:r>
+          </w:p>
+        </w:tc>
+        <w:tc>
+          <w:tcPr>
+            <w:tcW w:type="dxa" w:w="1191"/>
+            <w:shd w:val="clear" w:color="auto" w:fill="0E9F5A"/>
+          </w:tcPr>
+          <w:p>
+            <w:r/>
+            <w:r>
+              <w:rPr>
+                <w:b/>
+                <w:color w:val="FFFFFF"/>
+                <w:sz w:val="17"/>
+              </w:rPr>
+              <w:t>Expected lag</w:t>
+            </w:r>
+          </w:p>
+        </w:tc>
+        <w:tc>
+          <w:tcPr>
+            <w:tcW w:type="dxa" w:w="1871"/>
+            <w:shd w:val="clear" w:color="auto" w:fill="0E9F5A"/>
+          </w:tcPr>
+          <w:p>
+            <w:r/>
+            <w:r>
+              <w:rPr>
+                <w:b/>
+                <w:color w:val="FFFFFF"/>
+                <w:sz w:val="17"/>
+              </w:rPr>
+              <w:t>Derived columns</w:t>
+            </w:r>
+          </w:p>
+        </w:tc>
+      </w:tr>
+      <w:tr>
+        <w:tc>
+          <w:tcPr>
+            <w:tcW w:type="dxa" w:w="2721"/>
+          </w:tcPr>
+          <w:p>
+            <w:r/>
+            <w:r>
+              <w:rPr>
+                <w:sz w:val="17"/>
+              </w:rPr>
+              <w:t>Error board events (sda_ops)</w:t>
+            </w:r>
+          </w:p>
+        </w:tc>
+        <w:tc>
+          <w:tcPr>
+            <w:tcW w:type="dxa" w:w="2891"/>
+          </w:tcPr>
+          <w:p>
+            <w:r/>
+            <w:r>
+              <w:rPr>
+                <w:sz w:val="17"/>
+              </w:rPr>
+              <w:t>sda_ops (prod read model) · error_events · occurred_at</w:t>
+            </w:r>
+          </w:p>
+        </w:tc>
+        <w:tc>
+          <w:tcPr>
+            <w:tcW w:type="dxa" w:w="4422"/>
+          </w:tcPr>
+          <w:p>
+            <w:r/>
+            <w:r>
+              <w:rPr>
+                <w:sz w:val="17"/>
+              </w:rPr>
+              <w:t>nexus_full on prod (workflow_states + api_logs) — L2: /operations-console board, nexus DB</w:t>
+            </w:r>
+          </w:p>
+        </w:tc>
+        <w:tc>
+          <w:tcPr>
+            <w:tcW w:type="dxa" w:w="2721"/>
+          </w:tcPr>
+          <w:p>
+            <w:r/>
+            <w:r>
+              <w:rPr>
+                <w:sz w:val="17"/>
+              </w:rPr>
+              <w:t>ops-ingest-watch (db-watch) → sda_ops</w:t>
+            </w:r>
+          </w:p>
+        </w:tc>
+        <w:tc>
+          <w:tcPr>
+            <w:tcW w:type="dxa" w:w="1191"/>
+          </w:tcPr>
+          <w:p>
+            <w:r/>
+            <w:r>
+              <w:rPr>
+                <w:sz w:val="17"/>
+              </w:rPr>
+              <w:t>15 min</w:t>
+            </w:r>
+          </w:p>
+        </w:tc>
+        <w:tc>
+          <w:tcPr>
+            <w:tcW w:type="dxa" w:w="1871"/>
+          </w:tcPr>
+          <w:p>
+            <w:r/>
+            <w:r>
+              <w:rPr>
+                <w:sz w:val="17"/>
+              </w:rPr>
+              <w:t>channel · cls · provider · resp</w:t>
+            </w:r>
+          </w:p>
+        </w:tc>
+      </w:tr>
+      <w:tr>
+        <w:tc>
+          <w:tcPr>
+            <w:tcW w:type="dxa" w:w="2721"/>
+          </w:tcPr>
+          <w:p>
+            <w:r/>
+            <w:r>
+              <w:rPr>
+                <w:sz w:val="17"/>
+              </w:rPr>
+              <w:t>Order attempts / journeys (sda_ops)</w:t>
+            </w:r>
+          </w:p>
+        </w:tc>
+        <w:tc>
+          <w:tcPr>
+            <w:tcW w:type="dxa" w:w="2891"/>
+          </w:tcPr>
+          <w:p>
+            <w:r/>
+            <w:r>
+              <w:rPr>
+                <w:sz w:val="17"/>
+              </w:rPr>
+              <w:t>sda_ops (prod read model) · order_attempts · started_at</w:t>
+            </w:r>
+          </w:p>
+        </w:tc>
+        <w:tc>
+          <w:tcPr>
+            <w:tcW w:type="dxa" w:w="4422"/>
+          </w:tcPr>
+          <w:p>
+            <w:r/>
+            <w:r>
+              <w:rPr>
+                <w:sz w:val="17"/>
+              </w:rPr>
+              <w:t>nexus_full · workflow_states — L2: /operations-console, nexus DB</w:t>
+            </w:r>
+          </w:p>
+        </w:tc>
+        <w:tc>
+          <w:tcPr>
+            <w:tcW w:type="dxa" w:w="2721"/>
+          </w:tcPr>
+          <w:p>
+            <w:r/>
+            <w:r>
+              <w:rPr>
+                <w:sz w:val="17"/>
+              </w:rPr>
+              <w:t>ops-ingest-watch (db-watch) → sda_ops</w:t>
+            </w:r>
+          </w:p>
+        </w:tc>
+        <w:tc>
+          <w:tcPr>
+            <w:tcW w:type="dxa" w:w="1191"/>
+          </w:tcPr>
+          <w:p>
+            <w:r/>
+            <w:r>
+              <w:rPr>
+                <w:sz w:val="17"/>
+              </w:rPr>
+              <w:t>15 min</w:t>
+            </w:r>
+          </w:p>
+        </w:tc>
+        <w:tc>
+          <w:tcPr>
+            <w:tcW w:type="dxa" w:w="1871"/>
+          </w:tcPr>
+          <w:p>
+            <w:r/>
+            <w:r>
+              <w:rPr>
+                <w:sz w:val="17"/>
+              </w:rPr>
+              <w:t>channel</w:t>
+            </w:r>
+          </w:p>
+        </w:tc>
+      </w:tr>
+      <w:tr>
+        <w:tc>
+          <w:tcPr>
+            <w:tcW w:type="dxa" w:w="2721"/>
+          </w:tcPr>
+          <w:p>
+            <w:r/>
+            <w:r>
+              <w:rPr>
+                <w:sz w:val="17"/>
+              </w:rPr>
+              <w:t>Outbound integration calls (sda_ops)</w:t>
+            </w:r>
+          </w:p>
+        </w:tc>
+        <w:tc>
+          <w:tcPr>
+            <w:tcW w:type="dxa" w:w="2891"/>
+          </w:tcPr>
+          <w:p>
+            <w:r/>
+            <w:r>
+              <w:rPr>
+                <w:sz w:val="17"/>
+              </w:rPr>
+              <w:t>sda_ops (prod read model) · api_calls · created_at</w:t>
+            </w:r>
+          </w:p>
+        </w:tc>
+        <w:tc>
+          <w:tcPr>
+            <w:tcW w:type="dxa" w:w="4422"/>
+          </w:tcPr>
+          <w:p>
+            <w:r/>
+            <w:r>
+              <w:rPr>
+                <w:sz w:val="17"/>
+              </w:rPr>
+              <w:t>nexus_full · api_logs (TLS / DAWIYAT / STC / SALAM / ACES / MOBILY endpoints) — L2: provider portals</w:t>
+            </w:r>
+          </w:p>
+        </w:tc>
+        <w:tc>
+          <w:tcPr>
+            <w:tcW w:type="dxa" w:w="2721"/>
+          </w:tcPr>
+          <w:p>
+            <w:r/>
+            <w:r>
+              <w:rPr>
+                <w:sz w:val="17"/>
+              </w:rPr>
+              <w:t>ops-ingest-watch (api_logs) → sda_ops</w:t>
+            </w:r>
+          </w:p>
+        </w:tc>
+        <w:tc>
+          <w:tcPr>
+            <w:tcW w:type="dxa" w:w="1191"/>
+          </w:tcPr>
+          <w:p>
+            <w:r/>
+            <w:r>
+              <w:rPr>
+                <w:sz w:val="17"/>
+              </w:rPr>
+              <w:t>15 min</w:t>
+            </w:r>
+          </w:p>
+        </w:tc>
+        <w:tc>
+          <w:tcPr>
+            <w:tcW w:type="dxa" w:w="1871"/>
+          </w:tcPr>
+          <w:p>
+            <w:r/>
+            <w:r>
+              <w:rPr>
+                <w:sz w:val="17"/>
+              </w:rPr>
+              <w:t>host · family · technical</w:t>
+            </w:r>
+          </w:p>
+        </w:tc>
+      </w:tr>
+      <w:tr>
+        <w:tc>
+          <w:tcPr>
+            <w:tcW w:type="dxa" w:w="2721"/>
+          </w:tcPr>
+          <w:p>
+            <w:r/>
+            <w:r>
+              <w:rPr>
+                <w:sz w:val="17"/>
+              </w:rPr>
+              <w:t>Error board events — beta (Epurchase + Salam Home app)</w:t>
+            </w:r>
+          </w:p>
+        </w:tc>
+        <w:tc>
+          <w:tcPr>
+            <w:tcW w:type="dxa" w:w="2891"/>
+          </w:tcPr>
+          <w:p>
+            <w:r/>
+            <w:r>
+              <w:rPr>
+                <w:sz w:val="17"/>
+              </w:rPr>
+              <w:t>sda_ops_beta · error_events · occurred_at</w:t>
+            </w:r>
+          </w:p>
+        </w:tc>
+        <w:tc>
+          <w:tcPr>
+            <w:tcW w:type="dxa" w:w="4422"/>
+          </w:tcPr>
+          <w:p>
+            <w:r/>
+            <w:r>
+              <w:rPr>
+                <w:sz w:val="17"/>
+              </w:rPr>
+              <w:t>nexus_full B2C scope — L2: /operations-console-beta</w:t>
+            </w:r>
+          </w:p>
+        </w:tc>
+        <w:tc>
+          <w:tcPr>
+            <w:tcW w:type="dxa" w:w="2721"/>
+          </w:tcPr>
+          <w:p>
+            <w:r/>
+            <w:r>
+              <w:rPr>
+                <w:sz w:val="17"/>
+              </w:rPr>
+              <w:t>opsb-ingest-watch → sda_ops_beta (crash-looping since 22 Aug 2026)</w:t>
+            </w:r>
+          </w:p>
+        </w:tc>
+        <w:tc>
+          <w:tcPr>
+            <w:tcW w:type="dxa" w:w="1191"/>
+          </w:tcPr>
+          <w:p>
+            <w:r/>
+            <w:r>
+              <w:rPr>
+                <w:sz w:val="17"/>
+              </w:rPr>
+              <w:t>15 min</w:t>
+            </w:r>
+          </w:p>
+        </w:tc>
+        <w:tc>
+          <w:tcPr>
+            <w:tcW w:type="dxa" w:w="1871"/>
+          </w:tcPr>
+          <w:p>
+            <w:r/>
+            <w:r>
+              <w:rPr>
+                <w:sz w:val="17"/>
+              </w:rPr>
+              <w:t>channel · cls · provider · resp</w:t>
+            </w:r>
+          </w:p>
+        </w:tc>
+      </w:tr>
+      <w:tr>
+        <w:tc>
+          <w:tcPr>
+            <w:tcW w:type="dxa" w:w="2721"/>
+          </w:tcPr>
+          <w:p>
+            <w:r/>
+            <w:r>
+              <w:rPr>
+                <w:sz w:val="17"/>
+              </w:rPr>
+              <w:t>App log — per-step outcomes (combined.log)</w:t>
+            </w:r>
+          </w:p>
+        </w:tc>
+        <w:tc>
+          <w:tcPr>
+            <w:tcW w:type="dxa" w:w="2891"/>
+          </w:tcPr>
+          <w:p>
+            <w:r/>
+            <w:r>
+              <w:rPr>
+                <w:sz w:val="17"/>
+              </w:rPr>
+              <w:t>unified_console · fixed_app_events · ts</w:t>
+            </w:r>
+          </w:p>
+        </w:tc>
+        <w:tc>
+          <w:tcPr>
+            <w:tcW w:type="dxa" w:w="4422"/>
+          </w:tcPr>
+          <w:p>
+            <w:r/>
+            <w:r>
+              <w:rPr>
+                <w:sz w:val="17"/>
+              </w:rPr>
+              <w:t>/app/log/sda/combined.log on 146 (RUH-App-P01) — L2: tail on the app node</w:t>
+            </w:r>
+          </w:p>
+        </w:tc>
+        <w:tc>
+          <w:tcPr>
+            <w:tcW w:type="dxa" w:w="2721"/>
+          </w:tcPr>
+          <w:p>
+            <w:r/>
+            <w:r>
+              <w:rPr>
+                <w:sz w:val="17"/>
+              </w:rPr>
+              <w:t>ssh byte-watermark tail (fixedAppLogCollector, FIXED_LOG_HOSTS)</w:t>
+            </w:r>
+          </w:p>
+        </w:tc>
+        <w:tc>
+          <w:tcPr>
+            <w:tcW w:type="dxa" w:w="1191"/>
+          </w:tcPr>
+          <w:p>
+            <w:r/>
+            <w:r>
+              <w:rPr>
+                <w:sz w:val="17"/>
+              </w:rPr>
+              <w:t>3 min</w:t>
+            </w:r>
+          </w:p>
+        </w:tc>
+        <w:tc>
+          <w:tcPr>
+            <w:tcW w:type="dxa" w:w="1871"/>
+          </w:tcPr>
+          <w:p>
+            <w:r/>
+            <w:r>
+              <w:rPr>
+                <w:sz w:val="17"/>
+              </w:rPr>
+              <w:t>—</w:t>
+            </w:r>
+          </w:p>
+        </w:tc>
+      </w:tr>
+      <w:tr>
+        <w:tc>
+          <w:tcPr>
+            <w:tcW w:type="dxa" w:w="2721"/>
+          </w:tcPr>
+          <w:p>
+            <w:r/>
+            <w:r>
+              <w:rPr>
+                <w:sz w:val="17"/>
+              </w:rPr>
+              <w:t>Yakeen / ELM synthetic probe runs</w:t>
+            </w:r>
+          </w:p>
+        </w:tc>
+        <w:tc>
+          <w:tcPr>
+            <w:tcW w:type="dxa" w:w="2891"/>
+          </w:tcPr>
+          <w:p>
+            <w:r/>
+            <w:r>
+              <w:rPr>
+                <w:sz w:val="17"/>
+              </w:rPr>
+              <w:t>unified_console · yakeen_probe_runs · run_at</w:t>
+            </w:r>
+          </w:p>
+        </w:tc>
+        <w:tc>
+          <w:tcPr>
+            <w:tcW w:type="dxa" w:w="4422"/>
+          </w:tcPr>
+          <w:p>
+            <w:r/>
+            <w:r>
+              <w:rPr>
+                <w:sz w:val="17"/>
+              </w:rPr>
+              <w:t>ELM Yakeen endpoints (login + 4 data calls via 146) — L2: ELM support portal</w:t>
+            </w:r>
+          </w:p>
+        </w:tc>
+        <w:tc>
+          <w:tcPr>
+            <w:tcW w:type="dxa" w:w="2721"/>
+          </w:tcPr>
+          <w:p>
+            <w:r/>
+            <w:r>
+              <w:rPr>
+                <w:sz w:val="17"/>
+              </w:rPr>
+              <w:t>scheduled probe 10:00 / 16:00 / 22:00 KSA + manual (capped)</w:t>
+            </w:r>
+          </w:p>
+        </w:tc>
+        <w:tc>
+          <w:tcPr>
+            <w:tcW w:type="dxa" w:w="1191"/>
+          </w:tcPr>
+          <w:p>
+            <w:r/>
+            <w:r>
+              <w:rPr>
+                <w:sz w:val="17"/>
+              </w:rPr>
+              <w:t>480 min</w:t>
+            </w:r>
+          </w:p>
+        </w:tc>
+        <w:tc>
+          <w:tcPr>
+            <w:tcW w:type="dxa" w:w="1871"/>
+          </w:tcPr>
+          <w:p>
+            <w:r/>
+            <w:r>
+              <w:rPr>
+                <w:sz w:val="17"/>
+              </w:rPr>
+              <w:t>—</w:t>
+            </w:r>
+          </w:p>
+        </w:tc>
+      </w:tr>
+      <w:tr>
+        <w:tc>
+          <w:tcPr>
+            <w:tcW w:type="dxa" w:w="2721"/>
+          </w:tcPr>
+          <w:p>
+            <w:r/>
+            <w:r>
+              <w:rPr>
+                <w:sz w:val="17"/>
+              </w:rPr>
+              <w:t>Board hourly rollup (baselines)</w:t>
+            </w:r>
+          </w:p>
+        </w:tc>
+        <w:tc>
+          <w:tcPr>
+            <w:tcW w:type="dxa" w:w="2891"/>
+          </w:tcPr>
+          <w:p>
+            <w:r/>
+            <w:r>
+              <w:rPr>
+                <w:sz w:val="17"/>
+              </w:rPr>
+              <w:t>unified_console · fixed_board_hourly · hour</w:t>
+            </w:r>
+          </w:p>
+        </w:tc>
+        <w:tc>
+          <w:tcPr>
+            <w:tcW w:type="dxa" w:w="4422"/>
+          </w:tcPr>
+          <w:p>
+            <w:r/>
+            <w:r>
+              <w:rPr>
+                <w:sz w:val="17"/>
+              </w:rPr>
+              <w:t>derived from error_events — no prod equivalent</w:t>
+            </w:r>
+          </w:p>
+        </w:tc>
+        <w:tc>
+          <w:tcPr>
+            <w:tcW w:type="dxa" w:w="2721"/>
+          </w:tcPr>
+          <w:p>
+            <w:r/>
+            <w:r>
+              <w:rPr>
+                <w:sz w:val="17"/>
+              </w:rPr>
+              <w:t>5-min rollup loop (fixedChannelMetrics)</w:t>
+            </w:r>
+          </w:p>
+        </w:tc>
+        <w:tc>
+          <w:tcPr>
+            <w:tcW w:type="dxa" w:w="1191"/>
+          </w:tcPr>
+          <w:p>
+            <w:r/>
+            <w:r>
+              <w:rPr>
+                <w:sz w:val="17"/>
+              </w:rPr>
+              <w:t>70 min (info only)</w:t>
+            </w:r>
+          </w:p>
+        </w:tc>
+        <w:tc>
+          <w:tcPr>
+            <w:tcW w:type="dxa" w:w="1871"/>
+          </w:tcPr>
+          <w:p>
+            <w:r/>
+            <w:r>
+              <w:rPr>
+                <w:sz w:val="17"/>
+              </w:rPr>
+              <w:t>—</w:t>
             </w:r>
           </w:p>
         </w:tc>

</xml_diff>